<commit_message>
Árbol de problemas: justificación de módulos de relé frente a relés sueltos
Nueva sección antes de «Niveles de control del telar» con las razones
técnicas (corriente y tensión de la bobina frente al pin del ESP32, etapa
de transistor y diodo, optoacoplador, arranque seguro con pull-up y
pull-down, confiabilidad, mantenimiento y costo) y una tabla comparativa.

Co-Authored-By: Claude Opus 5.5 <noreply@anthropic.com>
Claude-Session: https://claude.ai/code/session_01QiY8ZZNAM9gwPKiqSkCaaj
</commit_message>
<xml_diff>
--- a/documentacion_proyecto/Arbol de problemas y soluciones.docx
+++ b/documentacion_proyecto/Arbol de problemas y soluciones.docx
@@ -3890,6 +3890,1446 @@
           <w:rtl w:val="0"/>
         </w:rPr>
       </w:r>
+    </w:p>
+    <w:p>
+      <w:pPr>
+        <w:rPr>
+          <w:rFonts w:ascii="IBM Plex Sans" w:cs="IBM Plex Sans" w:eastAsia="IBM Plex Sans" w:hAnsi="IBM Plex Sans"/>
+        </w:rPr>
+      </w:pPr>
+      <w:r>
+        <w:rPr>
+          <w:rFonts w:ascii="Questrial" w:cs="Questrial" w:eastAsia="Questrial" w:hAnsi="Questrial"/>
+          <w:b w:val="1"/>
+          <w:bCs w:val="1"/>
+          <w:color w:val="1E3A5F"/>
+          <w:sz w:val="28"/>
+          <w:szCs w:val="28"/>
+          <w:rtl w:val="0"/>
+        </w:rPr>
+        <w:t xml:space="preserve">Por qué usamos módulos de relé y no relés sueltos</w:t>
+      </w:r>
+    </w:p>
+    <w:p>
+      <w:pPr>
+        <w:jc w:val="both"/>
+        <w:rPr>
+          <w:rFonts w:ascii="IBM Plex Sans" w:cs="IBM Plex Sans" w:eastAsia="IBM Plex Sans" w:hAnsi="IBM Plex Sans"/>
+        </w:rPr>
+      </w:pPr>
+      <w:r>
+        <w:rPr>
+          <w:rFonts w:ascii="IBM Plex Sans" w:cs="IBM Plex Sans" w:eastAsia="IBM Plex Sans" w:hAnsi="IBM Plex Sans"/>
+          <w:rtl w:val="0"/>
+        </w:rPr>
+        <w:t xml:space="preserve">En el Nivel 1, el ESP32 tiene que «apretar» tres botones de la botonera del telar (Marcha, Pausa y Retroceder), que trabajan con 24 V de alterna. Hay dos formas de hacerlo: comprar relés sueltos, por ejemplo el Songle SRD-05VDC-SL-C (el mismo relé que traen los módulos), y armar alrededor de cada uno el circuito que lo maneja; o usar módulos de relé, que traen ese circuito armado y probado de fábrica. Elegimos los módulos: uno de dos canales para Marcha y Pausa, y uno individual para Retroceder. Estas son las razones técnicas.</w:t>
+      </w:r>
+    </w:p>
+    <w:p>
+      <w:pPr>
+        <w:rPr>
+          <w:rFonts w:ascii="IBM Plex Sans" w:cs="IBM Plex Sans" w:eastAsia="IBM Plex Sans" w:hAnsi="IBM Plex Sans"/>
+        </w:rPr>
+      </w:pPr>
+    </w:p>
+    <w:p>
+      <w:pPr>
+        <w:rPr>
+          <w:rFonts w:ascii="IBM Plex Sans" w:cs="IBM Plex Sans" w:eastAsia="IBM Plex Sans" w:hAnsi="IBM Plex Sans"/>
+        </w:rPr>
+      </w:pPr>
+      <w:r>
+        <w:rPr>
+          <w:rFonts w:ascii="Questrial" w:cs="Questrial" w:eastAsia="Questrial" w:hAnsi="Questrial"/>
+          <w:b w:val="1"/>
+          <w:bCs w:val="1"/>
+          <w:color w:val="3D6B96"/>
+          <w:sz w:val="26"/>
+          <w:szCs w:val="26"/>
+          <w:rtl w:val="0"/>
+        </w:rPr>
+        <w:t xml:space="preserve">1. El ESP32 no puede mover la bobina de un relé por sí solo</w:t>
+      </w:r>
+    </w:p>
+    <w:p>
+      <w:pPr>
+        <w:jc w:val="both"/>
+        <w:rPr>
+          <w:rFonts w:ascii="IBM Plex Sans" w:cs="IBM Plex Sans" w:eastAsia="IBM Plex Sans" w:hAnsi="IBM Plex Sans"/>
+        </w:rPr>
+      </w:pPr>
+      <w:r>
+        <w:rPr>
+          <w:rFonts w:ascii="IBM Plex Sans" w:cs="IBM Plex Sans" w:eastAsia="IBM Plex Sans" w:hAnsi="IBM Plex Sans"/>
+          <w:rtl w:val="0"/>
+        </w:rPr>
+        <w:t xml:space="preserve">La bobina del SRD-05VDC-SL-C está pensada para 5 V: tiene unos 70 Ω y consume alrededor de 71 mA (0,36 W). Para cerrar el contacto necesita como mínimo el 75 % de su tensión nominal, es decir, unos 3,75 V. Un pin del ESP32, en cambio, trabaja con lógica de 3,3 V, y el fabricante fija para cada pin una corriente máxima del orden de 40 mA, con valores de trabajo recomendados bastante menores.</w:t>
+      </w:r>
+    </w:p>
+    <w:p>
+      <w:pPr>
+        <w:numPr>
+          <w:ilvl w:val="0"/>
+          <w:numId w:val="7"/>
+        </w:numPr>
+        <w:ind w:left="720" w:hanging="360"/>
+        <w:jc w:val="both"/>
+        <w:rPr>
+          <w:rFonts w:ascii="IBM Plex Sans" w:cs="IBM Plex Sans" w:eastAsia="IBM Plex Sans" w:hAnsi="IBM Plex Sans"/>
+        </w:rPr>
+      </w:pPr>
+      <w:r>
+        <w:rPr>
+          <w:rFonts w:ascii="IBM Plex Sans" w:cs="IBM Plex Sans" w:eastAsia="IBM Plex Sans" w:hAnsi="IBM Plex Sans"/>
+          <w:b w:val="1"/>
+          <w:bCs w:val="1"/>
+          <w:rtl w:val="0"/>
+        </w:rPr>
+        <w:t xml:space="preserve">Tensión:</w:t>
+      </w:r>
+      <w:r>
+        <w:rPr>
+          <w:rFonts w:ascii="IBM Plex Sans" w:cs="IBM Plex Sans" w:eastAsia="IBM Plex Sans" w:hAnsi="IBM Plex Sans"/>
+          <w:rtl w:val="0"/>
+        </w:rPr>
+        <w:t xml:space="preserve"> 3,3 V no alcanzan los 3,75 V que el relé necesita para enganchar con seguridad.</w:t>
+      </w:r>
+    </w:p>
+    <w:p>
+      <w:pPr>
+        <w:numPr>
+          <w:ilvl w:val="0"/>
+          <w:numId w:val="7"/>
+        </w:numPr>
+        <w:ind w:left="720" w:hanging="360"/>
+        <w:jc w:val="both"/>
+        <w:rPr>
+          <w:rFonts w:ascii="IBM Plex Sans" w:cs="IBM Plex Sans" w:eastAsia="IBM Plex Sans" w:hAnsi="IBM Plex Sans"/>
+        </w:rPr>
+      </w:pPr>
+      <w:r>
+        <w:rPr>
+          <w:rFonts w:ascii="IBM Plex Sans" w:cs="IBM Plex Sans" w:eastAsia="IBM Plex Sans" w:hAnsi="IBM Plex Sans"/>
+          <w:b w:val="1"/>
+          <w:bCs w:val="1"/>
+          <w:rtl w:val="0"/>
+        </w:rPr>
+        <w:t xml:space="preserve">Corriente:</w:t>
+      </w:r>
+      <w:r>
+        <w:rPr>
+          <w:rFonts w:ascii="IBM Plex Sans" w:cs="IBM Plex Sans" w:eastAsia="IBM Plex Sans" w:hAnsi="IBM Plex Sans"/>
+          <w:rtl w:val="0"/>
+        </w:rPr>
+        <w:t xml:space="preserve"> 71 mA es casi el doble del máximo de un pin. Conectar la bobina directo dañaría la salida del ESP32 o lo haría reiniciarse.</w:t>
+      </w:r>
+    </w:p>
+    <w:p>
+      <w:pPr>
+        <w:jc w:val="both"/>
+        <w:rPr>
+          <w:rFonts w:ascii="IBM Plex Sans" w:cs="IBM Plex Sans" w:eastAsia="IBM Plex Sans" w:hAnsi="IBM Plex Sans"/>
+        </w:rPr>
+      </w:pPr>
+      <w:r>
+        <w:rPr>
+          <w:rFonts w:ascii="IBM Plex Sans" w:cs="IBM Plex Sans" w:eastAsia="IBM Plex Sans" w:hAnsi="IBM Plex Sans"/>
+          <w:rtl w:val="0"/>
+        </w:rPr>
+        <w:t xml:space="preserve">Por eso un relé nunca se conecta directo al ESP32: hace falta una etapa intermedia que tome la corriente de los 5 V de la fuente y deje al pin solo la tarea de dar la orden.</w:t>
+      </w:r>
+    </w:p>
+    <w:p>
+      <w:pPr>
+        <w:rPr>
+          <w:rFonts w:ascii="IBM Plex Sans" w:cs="IBM Plex Sans" w:eastAsia="IBM Plex Sans" w:hAnsi="IBM Plex Sans"/>
+        </w:rPr>
+      </w:pPr>
+    </w:p>
+    <w:p>
+      <w:pPr>
+        <w:rPr>
+          <w:rFonts w:ascii="IBM Plex Sans" w:cs="IBM Plex Sans" w:eastAsia="IBM Plex Sans" w:hAnsi="IBM Plex Sans"/>
+        </w:rPr>
+      </w:pPr>
+      <w:r>
+        <w:rPr>
+          <w:rFonts w:ascii="Questrial" w:cs="Questrial" w:eastAsia="Questrial" w:hAnsi="Questrial"/>
+          <w:b w:val="1"/>
+          <w:bCs w:val="1"/>
+          <w:color w:val="3D6B96"/>
+          <w:sz w:val="26"/>
+          <w:szCs w:val="26"/>
+          <w:rtl w:val="0"/>
+        </w:rPr>
+        <w:t xml:space="preserve">2. Lo que habría que agregar alrededor de cada relé suelto</w:t>
+      </w:r>
+    </w:p>
+    <w:p>
+      <w:pPr>
+        <w:jc w:val="both"/>
+        <w:rPr>
+          <w:rFonts w:ascii="IBM Plex Sans" w:cs="IBM Plex Sans" w:eastAsia="IBM Plex Sans" w:hAnsi="IBM Plex Sans"/>
+        </w:rPr>
+      </w:pPr>
+      <w:r>
+        <w:rPr>
+          <w:rFonts w:ascii="IBM Plex Sans" w:cs="IBM Plex Sans" w:eastAsia="IBM Plex Sans" w:hAnsi="IBM Plex Sans"/>
+          <w:rtl w:val="0"/>
+        </w:rPr>
+        <w:t xml:space="preserve">Para manejar un relé suelto desde el ESP32 hacen falta, por cada canal, como mínimo:</w:t>
+      </w:r>
+    </w:p>
+    <w:p>
+      <w:pPr>
+        <w:numPr>
+          <w:ilvl w:val="0"/>
+          <w:numId w:val="7"/>
+        </w:numPr>
+        <w:ind w:left="720" w:hanging="360"/>
+        <w:jc w:val="both"/>
+        <w:rPr>
+          <w:rFonts w:ascii="IBM Plex Sans" w:cs="IBM Plex Sans" w:eastAsia="IBM Plex Sans" w:hAnsi="IBM Plex Sans"/>
+        </w:rPr>
+      </w:pPr>
+      <w:r>
+        <w:rPr>
+          <w:rFonts w:ascii="IBM Plex Sans" w:cs="IBM Plex Sans" w:eastAsia="IBM Plex Sans" w:hAnsi="IBM Plex Sans"/>
+          <w:b w:val="1"/>
+          <w:bCs w:val="1"/>
+          <w:rtl w:val="0"/>
+        </w:rPr>
+        <w:t xml:space="preserve">Un transistor NPN</w:t>
+      </w:r>
+      <w:r>
+        <w:rPr>
+          <w:rFonts w:ascii="IBM Plex Sans" w:cs="IBM Plex Sans" w:eastAsia="IBM Plex Sans" w:hAnsi="IBM Plex Sans"/>
+          <w:rtl w:val="0"/>
+        </w:rPr>
+        <w:t xml:space="preserve"> (por ejemplo un BC547 o un 2N2222), que hace de llave para la corriente de la bobina.</w:t>
+      </w:r>
+    </w:p>
+    <w:p>
+      <w:pPr>
+        <w:numPr>
+          <w:ilvl w:val="0"/>
+          <w:numId w:val="7"/>
+        </w:numPr>
+        <w:ind w:left="720" w:hanging="360"/>
+        <w:jc w:val="both"/>
+        <w:rPr>
+          <w:rFonts w:ascii="IBM Plex Sans" w:cs="IBM Plex Sans" w:eastAsia="IBM Plex Sans" w:hAnsi="IBM Plex Sans"/>
+        </w:rPr>
+      </w:pPr>
+      <w:r>
+        <w:rPr>
+          <w:rFonts w:ascii="IBM Plex Sans" w:cs="IBM Plex Sans" w:eastAsia="IBM Plex Sans" w:hAnsi="IBM Plex Sans"/>
+          <w:b w:val="1"/>
+          <w:bCs w:val="1"/>
+          <w:rtl w:val="0"/>
+        </w:rPr>
+        <w:t xml:space="preserve">Una resistencia en la base del transistor</w:t>
+      </w:r>
+      <w:r>
+        <w:rPr>
+          <w:rFonts w:ascii="IBM Plex Sans" w:cs="IBM Plex Sans" w:eastAsia="IBM Plex Sans" w:hAnsi="IBM Plex Sans"/>
+          <w:rtl w:val="0"/>
+        </w:rPr>
+        <w:t xml:space="preserve"> (alrededor de 1 kΩ), que limita la corriente que sale del pin.</w:t>
+      </w:r>
+    </w:p>
+    <w:p>
+      <w:pPr>
+        <w:numPr>
+          <w:ilvl w:val="0"/>
+          <w:numId w:val="7"/>
+        </w:numPr>
+        <w:ind w:left="720" w:hanging="360"/>
+        <w:jc w:val="both"/>
+        <w:rPr>
+          <w:rFonts w:ascii="IBM Plex Sans" w:cs="IBM Plex Sans" w:eastAsia="IBM Plex Sans" w:hAnsi="IBM Plex Sans"/>
+        </w:rPr>
+      </w:pPr>
+      <w:r>
+        <w:rPr>
+          <w:rFonts w:ascii="IBM Plex Sans" w:cs="IBM Plex Sans" w:eastAsia="IBM Plex Sans" w:hAnsi="IBM Plex Sans"/>
+          <w:b w:val="1"/>
+          <w:bCs w:val="1"/>
+          <w:rtl w:val="0"/>
+        </w:rPr>
+        <w:t xml:space="preserve">Un diodo de protección</w:t>
+      </w:r>
+      <w:r>
+        <w:rPr>
+          <w:rFonts w:ascii="IBM Plex Sans" w:cs="IBM Plex Sans" w:eastAsia="IBM Plex Sans" w:hAnsi="IBM Plex Sans"/>
+          <w:rtl w:val="0"/>
+        </w:rPr>
+        <w:t xml:space="preserve"> (por ejemplo un 1N4007) en paralelo con la bobina y en sentido inverso. Cuando se corta la corriente, la bobina se comporta como un inductor y genera un pico de tensión inversa (V = L · di/dt) que puede superar varias veces la tensión de alimentación. Sin el diodo, ese pico puede perforar el transistor (el BC547 soporta 45 V entre colector y emisor) y además mete ruido en la línea de 5 V que alimenta al ESP32.</w:t>
+      </w:r>
+    </w:p>
+    <w:p>
+      <w:pPr>
+        <w:numPr>
+          <w:ilvl w:val="0"/>
+          <w:numId w:val="7"/>
+        </w:numPr>
+        <w:ind w:left="720" w:hanging="360"/>
+        <w:jc w:val="both"/>
+        <w:rPr>
+          <w:rFonts w:ascii="IBM Plex Sans" w:cs="IBM Plex Sans" w:eastAsia="IBM Plex Sans" w:hAnsi="IBM Plex Sans"/>
+        </w:rPr>
+      </w:pPr>
+      <w:r>
+        <w:rPr>
+          <w:rFonts w:ascii="IBM Plex Sans" w:cs="IBM Plex Sans" w:eastAsia="IBM Plex Sans" w:hAnsi="IBM Plex Sans"/>
+          <w:b w:val="1"/>
+          <w:bCs w:val="1"/>
+          <w:rtl w:val="0"/>
+        </w:rPr>
+        <w:t xml:space="preserve">Una resistencia que fije el estado del transistor</w:t>
+      </w:r>
+      <w:r>
+        <w:rPr>
+          <w:rFonts w:ascii="IBM Plex Sans" w:cs="IBM Plex Sans" w:eastAsia="IBM Plex Sans" w:hAnsi="IBM Plex Sans"/>
+          <w:rtl w:val="0"/>
+        </w:rPr>
+        <w:t xml:space="preserve"> mientras el ESP32 arranca y, opcionalmente, un LED con su resistencia para ver el estado del relé.</w:t>
+      </w:r>
+    </w:p>
+    <w:p>
+      <w:pPr>
+        <w:jc w:val="both"/>
+        <w:rPr>
+          <w:rFonts w:ascii="IBM Plex Sans" w:cs="IBM Plex Sans" w:eastAsia="IBM Plex Sans" w:hAnsi="IBM Plex Sans"/>
+        </w:rPr>
+      </w:pPr>
+      <w:r>
+        <w:rPr>
+          <w:rFonts w:ascii="IBM Plex Sans" w:cs="IBM Plex Sans" w:eastAsia="IBM Plex Sans" w:hAnsi="IBM Plex Sans"/>
+          <w:rtl w:val="0"/>
+        </w:rPr>
+        <w:t xml:space="preserve">En total son entre 4 y 6 componentes por canal: entre 12 y 18 piezas y más de 40 soldaduras para los tres relés. Ninguno de esos componentes está en la lista: habría que comprarlos, armarlos y verificarlos.</w:t>
+      </w:r>
+    </w:p>
+    <w:p>
+      <w:pPr>
+        <w:rPr>
+          <w:rFonts w:ascii="IBM Plex Sans" w:cs="IBM Plex Sans" w:eastAsia="IBM Plex Sans" w:hAnsi="IBM Plex Sans"/>
+        </w:rPr>
+      </w:pPr>
+    </w:p>
+    <w:p>
+      <w:pPr>
+        <w:rPr>
+          <w:rFonts w:ascii="IBM Plex Sans" w:cs="IBM Plex Sans" w:eastAsia="IBM Plex Sans" w:hAnsi="IBM Plex Sans"/>
+        </w:rPr>
+      </w:pPr>
+      <w:r>
+        <w:rPr>
+          <w:rFonts w:ascii="Questrial" w:cs="Questrial" w:eastAsia="Questrial" w:hAnsi="Questrial"/>
+          <w:b w:val="1"/>
+          <w:bCs w:val="1"/>
+          <w:color w:val="3D6B96"/>
+          <w:sz w:val="26"/>
+          <w:szCs w:val="26"/>
+          <w:rtl w:val="0"/>
+        </w:rPr>
+        <w:t xml:space="preserve">3. El módulo ya trae ese circuito resuelto</w:t>
+      </w:r>
+    </w:p>
+    <w:p>
+      <w:pPr>
+        <w:jc w:val="both"/>
+        <w:rPr>
+          <w:rFonts w:ascii="IBM Plex Sans" w:cs="IBM Plex Sans" w:eastAsia="IBM Plex Sans" w:hAnsi="IBM Plex Sans"/>
+        </w:rPr>
+      </w:pPr>
+      <w:r>
+        <w:rPr>
+          <w:rFonts w:ascii="IBM Plex Sans" w:cs="IBM Plex Sans" w:eastAsia="IBM Plex Sans" w:hAnsi="IBM Plex Sans"/>
+          <w:rtl w:val="0"/>
+        </w:rPr>
+        <w:t xml:space="preserve">Cada canal de un módulo de relé trae soldado y probado de fábrica todo lo anterior:</w:t>
+      </w:r>
+    </w:p>
+    <w:p>
+      <w:pPr>
+        <w:numPr>
+          <w:ilvl w:val="0"/>
+          <w:numId w:val="7"/>
+        </w:numPr>
+        <w:ind w:left="720" w:hanging="360"/>
+        <w:jc w:val="both"/>
+        <w:rPr>
+          <w:rFonts w:ascii="IBM Plex Sans" w:cs="IBM Plex Sans" w:eastAsia="IBM Plex Sans" w:hAnsi="IBM Plex Sans"/>
+        </w:rPr>
+      </w:pPr>
+      <w:r>
+        <w:rPr>
+          <w:rFonts w:ascii="IBM Plex Sans" w:cs="IBM Plex Sans" w:eastAsia="IBM Plex Sans" w:hAnsi="IBM Plex Sans"/>
+          <w:rtl w:val="0"/>
+        </w:rPr>
+        <w:t xml:space="preserve">El transistor, el diodo de protección contra el pico de la bobina, las resistencias y el LED que indica el estado de cada canal.</w:t>
+      </w:r>
+    </w:p>
+    <w:p>
+      <w:pPr>
+        <w:numPr>
+          <w:ilvl w:val="0"/>
+          <w:numId w:val="7"/>
+        </w:numPr>
+        <w:ind w:left="720" w:hanging="360"/>
+        <w:jc w:val="both"/>
+        <w:rPr>
+          <w:rFonts w:ascii="IBM Plex Sans" w:cs="IBM Plex Sans" w:eastAsia="IBM Plex Sans" w:hAnsi="IBM Plex Sans"/>
+        </w:rPr>
+      </w:pPr>
+      <w:r>
+        <w:rPr>
+          <w:rFonts w:ascii="IBM Plex Sans" w:cs="IBM Plex Sans" w:eastAsia="IBM Plex Sans" w:hAnsi="IBM Plex Sans"/>
+          <w:b w:val="1"/>
+          <w:bCs w:val="1"/>
+          <w:rtl w:val="0"/>
+        </w:rPr>
+        <w:t xml:space="preserve">En el módulo de dos canales, además, un optoacoplador por canal</w:t>
+      </w:r>
+      <w:r>
+        <w:rPr>
+          <w:rFonts w:ascii="IBM Plex Sans" w:cs="IBM Plex Sans" w:eastAsia="IBM Plex Sans" w:hAnsi="IBM Plex Sans"/>
+          <w:rtl w:val="0"/>
+        </w:rPr>
+        <w:t xml:space="preserve"> (un 817, el mismo componente que usamos en el sensado). La entrada IN enciende un LED interno y el transistor del relé se maneja con esa luz, sin conexión eléctrica directa con el pin del ESP32.</w:t>
+      </w:r>
+    </w:p>
+    <w:p>
+      <w:pPr>
+        <w:numPr>
+          <w:ilvl w:val="0"/>
+          <w:numId w:val="7"/>
+        </w:numPr>
+        <w:ind w:left="720" w:hanging="360"/>
+        <w:jc w:val="both"/>
+        <w:rPr>
+          <w:rFonts w:ascii="IBM Plex Sans" w:cs="IBM Plex Sans" w:eastAsia="IBM Plex Sans" w:hAnsi="IBM Plex Sans"/>
+        </w:rPr>
+      </w:pPr>
+      <w:r>
+        <w:rPr>
+          <w:rFonts w:ascii="IBM Plex Sans" w:cs="IBM Plex Sans" w:eastAsia="IBM Plex Sans" w:hAnsi="IBM Plex Sans"/>
+          <w:rtl w:val="0"/>
+        </w:rPr>
+        <w:t xml:space="preserve">Borneras de tornillo para los contactos (normal abierto, común y normal cerrado), dimensionadas para los 10 A del relé, y una tira de pines para las señales.</w:t>
+      </w:r>
+    </w:p>
+    <w:p>
+      <w:pPr>
+        <w:numPr>
+          <w:ilvl w:val="0"/>
+          <w:numId w:val="7"/>
+        </w:numPr>
+        <w:ind w:left="720" w:hanging="360"/>
+        <w:jc w:val="both"/>
+        <w:rPr>
+          <w:rFonts w:ascii="IBM Plex Sans" w:cs="IBM Plex Sans" w:eastAsia="IBM Plex Sans" w:hAnsi="IBM Plex Sans"/>
+        </w:rPr>
+      </w:pPr>
+      <w:r>
+        <w:rPr>
+          <w:rFonts w:ascii="IBM Plex Sans" w:cs="IBM Plex Sans" w:eastAsia="IBM Plex Sans" w:hAnsi="IBM Plex Sans"/>
+          <w:rtl w:val="0"/>
+        </w:rPr>
+        <w:t xml:space="preserve">En el de dos canales, el jumper JD-VCC, que permite alimentar las bobinas con una fuente separada si en el futuro hiciera falta aislar por completo el ESP32 del lado de los relés. Hoy va puesto y todo se alimenta con los mismos 5 V de la HLK-5M05.</w:t>
+      </w:r>
+    </w:p>
+    <w:p>
+      <w:pPr>
+        <w:rPr>
+          <w:rFonts w:ascii="IBM Plex Sans" w:cs="IBM Plex Sans" w:eastAsia="IBM Plex Sans" w:hAnsi="IBM Plex Sans"/>
+        </w:rPr>
+      </w:pPr>
+    </w:p>
+    <w:p>
+      <w:pPr>
+        <w:rPr>
+          <w:rFonts w:ascii="IBM Plex Sans" w:cs="IBM Plex Sans" w:eastAsia="IBM Plex Sans" w:hAnsi="IBM Plex Sans"/>
+        </w:rPr>
+      </w:pPr>
+      <w:r>
+        <w:rPr>
+          <w:rFonts w:ascii="Questrial" w:cs="Questrial" w:eastAsia="Questrial" w:hAnsi="Questrial"/>
+          <w:b w:val="1"/>
+          <w:bCs w:val="1"/>
+          <w:color w:val="3D6B96"/>
+          <w:sz w:val="26"/>
+          <w:szCs w:val="26"/>
+          <w:rtl w:val="0"/>
+        </w:rPr>
+        <w:t xml:space="preserve">4. Arranque seguro, con el firmware ya resuelto</w:t>
+      </w:r>
+    </w:p>
+    <w:p>
+      <w:pPr>
+        <w:jc w:val="both"/>
+        <w:rPr>
+          <w:rFonts w:ascii="IBM Plex Sans" w:cs="IBM Plex Sans" w:eastAsia="IBM Plex Sans" w:hAnsi="IBM Plex Sans"/>
+        </w:rPr>
+      </w:pPr>
+      <w:r>
+        <w:rPr>
+          <w:rFonts w:ascii="IBM Plex Sans" w:cs="IBM Plex Sans" w:eastAsia="IBM Plex Sans" w:hAnsi="IBM Plex Sans"/>
+          <w:rtl w:val="0"/>
+        </w:rPr>
+        <w:t xml:space="preserve">El firmware y el conexionado están hechos y probados en función de los módulos. El de dos canales es activo en bajo: el relé se cierra cuando el ESP32 pone el pin en 0 V. Por eso IN1 e IN2 llevan una resistencia de 10 kΩ a 3,3 V (pull-up), que mantiene abiertos los relés de Marcha y Pausa mientras el ESP32 arranca y sus pines todavía no están configurados. El de Retroceder es activo en alto y lleva, por la misma razón, una resistencia de 10 kΩ a GND (pull-down). La polaridad de cada relé está configurada en el firmware (RELE_MARCHA_ACTIVO_BAJO, RELE_PAUSA_ACTIVO_BAJO y RELE_RETROCEDER_ACTIVO_BAJO, en config.h).</w:t>
+      </w:r>
+    </w:p>
+    <w:p>
+      <w:pPr>
+        <w:jc w:val="both"/>
+        <w:rPr>
+          <w:rFonts w:ascii="IBM Plex Sans" w:cs="IBM Plex Sans" w:eastAsia="IBM Plex Sans" w:hAnsi="IBM Plex Sans"/>
+        </w:rPr>
+      </w:pPr>
+      <w:r>
+        <w:rPr>
+          <w:rFonts w:ascii="IBM Plex Sans" w:cs="IBM Plex Sans" w:eastAsia="IBM Plex Sans" w:hAnsi="IBM Plex Sans"/>
+          <w:rtl w:val="0"/>
+        </w:rPr>
+        <w:t xml:space="preserve">Con relés sueltos manejados por un transistor NPN, Marcha y Pausa pasarían a ser activos en alto. Si se dejara el mismo pull-up, el relé quedaría cerrado cada vez que el ESP32 se enciende o se reinicia: sería como apretar el botón de Marcha sin que nadie lo pida, y </w:t>
+      </w:r>
+      <w:r>
+        <w:rPr>
+          <w:rFonts w:ascii="IBM Plex Sans" w:cs="IBM Plex Sans" w:eastAsia="IBM Plex Sans" w:hAnsi="IBM Plex Sans"/>
+          <w:b w:val="1"/>
+          <w:bCs w:val="1"/>
+          <w:rtl w:val="0"/>
+        </w:rPr>
+        <w:t xml:space="preserve">el telar arrancaría solo</w:t>
+      </w:r>
+      <w:r>
+        <w:rPr>
+          <w:rFonts w:ascii="IBM Plex Sans" w:cs="IBM Plex Sans" w:eastAsia="IBM Plex Sans" w:hAnsi="IBM Plex Sans"/>
+          <w:rtl w:val="0"/>
+        </w:rPr>
+        <w:t xml:space="preserve">. Pasar a relés sueltos obligaría a rediseñar las resistencias de arranque, cambiar la configuración del firmware y repetir todas las pruebas.</w:t>
+      </w:r>
+    </w:p>
+    <w:p>
+      <w:pPr>
+        <w:rPr>
+          <w:rFonts w:ascii="IBM Plex Sans" w:cs="IBM Plex Sans" w:eastAsia="IBM Plex Sans" w:hAnsi="IBM Plex Sans"/>
+        </w:rPr>
+      </w:pPr>
+    </w:p>
+    <w:p>
+      <w:pPr>
+        <w:rPr>
+          <w:rFonts w:ascii="IBM Plex Sans" w:cs="IBM Plex Sans" w:eastAsia="IBM Plex Sans" w:hAnsi="IBM Plex Sans"/>
+        </w:rPr>
+      </w:pPr>
+      <w:r>
+        <w:rPr>
+          <w:rFonts w:ascii="Questrial" w:cs="Questrial" w:eastAsia="Questrial" w:hAnsi="Questrial"/>
+          <w:b w:val="1"/>
+          <w:bCs w:val="1"/>
+          <w:color w:val="3D6B96"/>
+          <w:sz w:val="26"/>
+          <w:szCs w:val="26"/>
+          <w:rtl w:val="0"/>
+        </w:rPr>
+        <w:t xml:space="preserve">5. Confiabilidad en el ambiente de la fábrica</w:t>
+      </w:r>
+    </w:p>
+    <w:p>
+      <w:pPr>
+        <w:jc w:val="both"/>
+        <w:rPr>
+          <w:rFonts w:ascii="IBM Plex Sans" w:cs="IBM Plex Sans" w:eastAsia="IBM Plex Sans" w:hAnsi="IBM Plex Sans"/>
+        </w:rPr>
+      </w:pPr>
+      <w:r>
+        <w:rPr>
+          <w:rFonts w:ascii="IBM Plex Sans" w:cs="IBM Plex Sans" w:eastAsia="IBM Plex Sans" w:hAnsi="IBM Plex Sans"/>
+          <w:rtl w:val="0"/>
+        </w:rPr>
+        <w:t xml:space="preserve">El gabinete va montado junto a un telar que vibra durante toda la jornada, en un ambiente con pelusa textil. Cada soldadura hecha a mano es un punto posible de falla, por vibración o por una soldadura fría. El módulo concentra el circuito del relé en una placa fabricada en serie, con pistas y separaciones de fábrica, y la plaqueta del proyecto queda con menos componentes y menos soldaduras.</w:t>
+      </w:r>
+    </w:p>
+    <w:p>
+      <w:pPr>
+        <w:jc w:val="both"/>
+        <w:rPr>
+          <w:rFonts w:ascii="IBM Plex Sans" w:cs="IBM Plex Sans" w:eastAsia="IBM Plex Sans" w:hAnsi="IBM Plex Sans"/>
+        </w:rPr>
+      </w:pPr>
+      <w:r>
+        <w:rPr>
+          <w:rFonts w:ascii="IBM Plex Sans" w:cs="IBM Plex Sans" w:eastAsia="IBM Plex Sans" w:hAnsi="IBM Plex Sans"/>
+          <w:rtl w:val="0"/>
+        </w:rPr>
+        <w:t xml:space="preserve">Además, la parte que más ruido eléctrico genera, la bobina que engancha y suelta, queda en una placa aparte, separada de la plaqueta donde están el ESP32 y los optoacopladores del sensado, con su capacitor de 100 nF cerca de cada módulo.</w:t>
+      </w:r>
+    </w:p>
+    <w:p>
+      <w:pPr>
+        <w:rPr>
+          <w:rFonts w:ascii="IBM Plex Sans" w:cs="IBM Plex Sans" w:eastAsia="IBM Plex Sans" w:hAnsi="IBM Plex Sans"/>
+        </w:rPr>
+      </w:pPr>
+    </w:p>
+    <w:p>
+      <w:pPr>
+        <w:rPr>
+          <w:rFonts w:ascii="IBM Plex Sans" w:cs="IBM Plex Sans" w:eastAsia="IBM Plex Sans" w:hAnsi="IBM Plex Sans"/>
+        </w:rPr>
+      </w:pPr>
+      <w:r>
+        <w:rPr>
+          <w:rFonts w:ascii="Questrial" w:cs="Questrial" w:eastAsia="Questrial" w:hAnsi="Questrial"/>
+          <w:b w:val="1"/>
+          <w:bCs w:val="1"/>
+          <w:color w:val="3D6B96"/>
+          <w:sz w:val="26"/>
+          <w:szCs w:val="26"/>
+          <w:rtl w:val="0"/>
+        </w:rPr>
+        <w:t xml:space="preserve">6. Mantenimiento y reemplazo</w:t>
+      </w:r>
+    </w:p>
+    <w:p>
+      <w:pPr>
+        <w:jc w:val="both"/>
+        <w:rPr>
+          <w:rFonts w:ascii="IBM Plex Sans" w:cs="IBM Plex Sans" w:eastAsia="IBM Plex Sans" w:hAnsi="IBM Plex Sans"/>
+        </w:rPr>
+      </w:pPr>
+      <w:r>
+        <w:rPr>
+          <w:rFonts w:ascii="IBM Plex Sans" w:cs="IBM Plex Sans" w:eastAsia="IBM Plex Sans" w:hAnsi="IBM Plex Sans"/>
+          <w:rtl w:val="0"/>
+        </w:rPr>
+        <w:t xml:space="preserve">Los módulos van atornillados sobre una plaqueta con separadores y tornillos M3, las señales llegan por cables dupont y los contactos por borneras. Si un relé se gasta o se daña, el módulo se cambia en pocos minutos con un destornillador, sin soldador y sin desarmar la plaqueta principal. Con un relé suelto habría que desoldar sus cinco patas y revisar el resto del circuito del canal.</w:t>
+      </w:r>
+    </w:p>
+    <w:p>
+      <w:pPr>
+        <w:rPr>
+          <w:rFonts w:ascii="IBM Plex Sans" w:cs="IBM Plex Sans" w:eastAsia="IBM Plex Sans" w:hAnsi="IBM Plex Sans"/>
+        </w:rPr>
+      </w:pPr>
+    </w:p>
+    <w:p>
+      <w:pPr>
+        <w:rPr>
+          <w:rFonts w:ascii="IBM Plex Sans" w:cs="IBM Plex Sans" w:eastAsia="IBM Plex Sans" w:hAnsi="IBM Plex Sans"/>
+        </w:rPr>
+      </w:pPr>
+      <w:r>
+        <w:rPr>
+          <w:rFonts w:ascii="Questrial" w:cs="Questrial" w:eastAsia="Questrial" w:hAnsi="Questrial"/>
+          <w:b w:val="1"/>
+          <w:bCs w:val="1"/>
+          <w:color w:val="3D6B96"/>
+          <w:sz w:val="26"/>
+          <w:szCs w:val="26"/>
+          <w:rtl w:val="0"/>
+        </w:rPr>
+        <w:t xml:space="preserve">7. Costo y disponibilidad</w:t>
+      </w:r>
+    </w:p>
+    <w:p>
+      <w:pPr>
+        <w:jc w:val="both"/>
+        <w:rPr>
+          <w:rFonts w:ascii="IBM Plex Sans" w:cs="IBM Plex Sans" w:eastAsia="IBM Plex Sans" w:hAnsi="IBM Plex Sans"/>
+        </w:rPr>
+      </w:pPr>
+      <w:r>
+        <w:rPr>
+          <w:rFonts w:ascii="IBM Plex Sans" w:cs="IBM Plex Sans" w:eastAsia="IBM Plex Sans" w:hAnsi="IBM Plex Sans"/>
+          <w:rtl w:val="0"/>
+        </w:rPr>
+        <w:t xml:space="preserve">Los módulos ya se compraron y están en la lista de componentes del Bloque A. Los relés sueltos obligarían a sumar a la lista los transistores, diodos y resistencias de cada canal, además de las horas de armado y de prueba.</w:t>
+      </w:r>
+    </w:p>
+    <w:p>
+      <w:pPr>
+        <w:rPr>
+          <w:rFonts w:ascii="IBM Plex Sans" w:cs="IBM Plex Sans" w:eastAsia="IBM Plex Sans" w:hAnsi="IBM Plex Sans"/>
+        </w:rPr>
+      </w:pPr>
+    </w:p>
+    <w:p>
+      <w:pPr>
+        <w:rPr>
+          <w:rFonts w:ascii="IBM Plex Sans" w:cs="IBM Plex Sans" w:eastAsia="IBM Plex Sans" w:hAnsi="IBM Plex Sans"/>
+        </w:rPr>
+      </w:pPr>
+      <w:r>
+        <w:rPr>
+          <w:rFonts w:ascii="Questrial" w:cs="Questrial" w:eastAsia="Questrial" w:hAnsi="Questrial"/>
+          <w:b w:val="1"/>
+          <w:bCs w:val="1"/>
+          <w:color w:val="3D6B96"/>
+          <w:sz w:val="26"/>
+          <w:szCs w:val="26"/>
+          <w:rtl w:val="0"/>
+        </w:rPr>
+        <w:t xml:space="preserve">Comparación</w:t>
+      </w:r>
+    </w:p>
+    <w:tbl>
+      <w:tblPr>
+        <w:tblW w:w="8838" w:type="dxa"/>
+        <w:tblBorders>
+          <w:top w:val="single" w:sz="4" w:space="0" w:color="C2CCD6"/>
+          <w:left w:val="single" w:sz="4" w:space="0" w:color="C2CCD6"/>
+          <w:bottom w:val="single" w:sz="4" w:space="0" w:color="C2CCD6"/>
+          <w:right w:val="single" w:sz="4" w:space="0" w:color="C2CCD6"/>
+          <w:insideH w:val="single" w:sz="4" w:space="0" w:color="C2CCD6"/>
+          <w:insideV w:val="single" w:sz="4" w:space="0" w:color="C2CCD6"/>
+        </w:tblBorders>
+        <w:tblLayout w:type="fixed"/>
+        <w:tblLook w:val="04A0" w:firstRow="1" w:lastRow="0" w:firstColumn="1" w:lastColumn="0" w:noHBand="0" w:noVBand="1"/>
+      </w:tblPr>
+      <w:tblGrid>
+        <w:gridCol w:w="2480"/>
+        <w:gridCol w:w="3179"/>
+        <w:gridCol w:w="3179"/>
+      </w:tblGrid>
+      <w:tr>
+        <w:trPr>
+          <w:tblHeader/>
+        </w:trPr>
+        <w:tc>
+          <w:tcPr>
+            <w:tcW w:w="2480" w:type="dxa"/>
+            <w:shd w:val="clear" w:color="auto" w:fill="1E3A5F"/>
+            <w:tcMar>
+              <w:top w:w="80" w:type="dxa"/>
+              <w:left w:w="110" w:type="dxa"/>
+              <w:bottom w:w="80" w:type="dxa"/>
+              <w:right w:w="110" w:type="dxa"/>
+            </w:tcMar>
+          </w:tcPr>
+          <w:p>
+            <w:pPr>
+              <w:spacing w:after="0"/>
+              <w:rPr>
+                <w:rFonts w:ascii="IBM Plex Sans" w:cs="IBM Plex Sans" w:eastAsia="IBM Plex Sans" w:hAnsi="IBM Plex Sans"/>
+              </w:rPr>
+            </w:pPr>
+            <w:r>
+              <w:rPr>
+                <w:rFonts w:ascii="IBM Plex Sans" w:cs="IBM Plex Sans" w:eastAsia="IBM Plex Sans" w:hAnsi="IBM Plex Sans"/>
+                <w:b w:val="1"/>
+                <w:bCs w:val="1"/>
+                <w:color w:val="F0F4F8"/>
+                <w:rtl w:val="0"/>
+              </w:rPr>
+              <w:t xml:space="preserve">Aspecto</w:t>
+            </w:r>
+          </w:p>
+        </w:tc>
+        <w:tc>
+          <w:tcPr>
+            <w:tcW w:w="3179" w:type="dxa"/>
+            <w:shd w:val="clear" w:color="auto" w:fill="1E3A5F"/>
+            <w:tcMar>
+              <w:top w:w="80" w:type="dxa"/>
+              <w:left w:w="110" w:type="dxa"/>
+              <w:bottom w:w="80" w:type="dxa"/>
+              <w:right w:w="110" w:type="dxa"/>
+            </w:tcMar>
+          </w:tcPr>
+          <w:p>
+            <w:pPr>
+              <w:spacing w:after="0"/>
+              <w:rPr>
+                <w:rFonts w:ascii="IBM Plex Sans" w:cs="IBM Plex Sans" w:eastAsia="IBM Plex Sans" w:hAnsi="IBM Plex Sans"/>
+              </w:rPr>
+            </w:pPr>
+            <w:r>
+              <w:rPr>
+                <w:rFonts w:ascii="IBM Plex Sans" w:cs="IBM Plex Sans" w:eastAsia="IBM Plex Sans" w:hAnsi="IBM Plex Sans"/>
+                <w:b w:val="1"/>
+                <w:bCs w:val="1"/>
+                <w:color w:val="F0F4F8"/>
+                <w:rtl w:val="0"/>
+              </w:rPr>
+              <w:t xml:space="preserve">Relé suelto</w:t>
+            </w:r>
+          </w:p>
+        </w:tc>
+        <w:tc>
+          <w:tcPr>
+            <w:tcW w:w="3179" w:type="dxa"/>
+            <w:shd w:val="clear" w:color="auto" w:fill="1E3A5F"/>
+            <w:tcMar>
+              <w:top w:w="80" w:type="dxa"/>
+              <w:left w:w="110" w:type="dxa"/>
+              <w:bottom w:w="80" w:type="dxa"/>
+              <w:right w:w="110" w:type="dxa"/>
+            </w:tcMar>
+          </w:tcPr>
+          <w:p>
+            <w:pPr>
+              <w:spacing w:after="0"/>
+              <w:rPr>
+                <w:rFonts w:ascii="IBM Plex Sans" w:cs="IBM Plex Sans" w:eastAsia="IBM Plex Sans" w:hAnsi="IBM Plex Sans"/>
+              </w:rPr>
+            </w:pPr>
+            <w:r>
+              <w:rPr>
+                <w:rFonts w:ascii="IBM Plex Sans" w:cs="IBM Plex Sans" w:eastAsia="IBM Plex Sans" w:hAnsi="IBM Plex Sans"/>
+                <w:b w:val="1"/>
+                <w:bCs w:val="1"/>
+                <w:color w:val="F0F4F8"/>
+                <w:rtl w:val="0"/>
+              </w:rPr>
+              <w:t xml:space="preserve">Módulo de relé</w:t>
+            </w:r>
+          </w:p>
+        </w:tc>
+      </w:tr>
+      <w:tr>
+        <w:tc>
+          <w:tcPr>
+            <w:tcW w:w="2480" w:type="dxa"/>
+            <w:shd w:val="clear" w:color="auto" w:fill="FFFFFF"/>
+            <w:tcMar>
+              <w:top w:w="80" w:type="dxa"/>
+              <w:left w:w="110" w:type="dxa"/>
+              <w:bottom w:w="80" w:type="dxa"/>
+              <w:right w:w="110" w:type="dxa"/>
+            </w:tcMar>
+          </w:tcPr>
+          <w:p>
+            <w:pPr>
+              <w:spacing w:after="0"/>
+              <w:rPr>
+                <w:rFonts w:ascii="IBM Plex Sans" w:cs="IBM Plex Sans" w:eastAsia="IBM Plex Sans" w:hAnsi="IBM Plex Sans"/>
+              </w:rPr>
+            </w:pPr>
+            <w:r>
+              <w:rPr>
+                <w:rFonts w:ascii="IBM Plex Sans" w:cs="IBM Plex Sans" w:eastAsia="IBM Plex Sans" w:hAnsi="IBM Plex Sans"/>
+                <w:rtl w:val="0"/>
+              </w:rPr>
+              <w:t xml:space="preserve">Manejo desde el ESP32</w:t>
+            </w:r>
+          </w:p>
+        </w:tc>
+        <w:tc>
+          <w:tcPr>
+            <w:tcW w:w="3179" w:type="dxa"/>
+            <w:shd w:val="clear" w:color="auto" w:fill="FFFFFF"/>
+            <w:tcMar>
+              <w:top w:w="80" w:type="dxa"/>
+              <w:left w:w="110" w:type="dxa"/>
+              <w:bottom w:w="80" w:type="dxa"/>
+              <w:right w:w="110" w:type="dxa"/>
+            </w:tcMar>
+          </w:tcPr>
+          <w:p>
+            <w:pPr>
+              <w:spacing w:after="0"/>
+              <w:rPr>
+                <w:rFonts w:ascii="IBM Plex Sans" w:cs="IBM Plex Sans" w:eastAsia="IBM Plex Sans" w:hAnsi="IBM Plex Sans"/>
+              </w:rPr>
+            </w:pPr>
+            <w:r>
+              <w:rPr>
+                <w:rFonts w:ascii="IBM Plex Sans" w:cs="IBM Plex Sans" w:eastAsia="IBM Plex Sans" w:hAnsi="IBM Plex Sans"/>
+                <w:rtl w:val="0"/>
+              </w:rPr>
+              <w:t xml:space="preserve">Necesita transistor, resistencia y diodo por canal</w:t>
+            </w:r>
+          </w:p>
+        </w:tc>
+        <w:tc>
+          <w:tcPr>
+            <w:tcW w:w="3179" w:type="dxa"/>
+            <w:shd w:val="clear" w:color="auto" w:fill="FFFFFF"/>
+            <w:tcMar>
+              <w:top w:w="80" w:type="dxa"/>
+              <w:left w:w="110" w:type="dxa"/>
+              <w:bottom w:w="80" w:type="dxa"/>
+              <w:right w:w="110" w:type="dxa"/>
+            </w:tcMar>
+          </w:tcPr>
+          <w:p>
+            <w:pPr>
+              <w:spacing w:after="0"/>
+              <w:rPr>
+                <w:rFonts w:ascii="IBM Plex Sans" w:cs="IBM Plex Sans" w:eastAsia="IBM Plex Sans" w:hAnsi="IBM Plex Sans"/>
+              </w:rPr>
+            </w:pPr>
+            <w:r>
+              <w:rPr>
+                <w:rFonts w:ascii="IBM Plex Sans" w:cs="IBM Plex Sans" w:eastAsia="IBM Plex Sans" w:hAnsi="IBM Plex Sans"/>
+                <w:rtl w:val="0"/>
+              </w:rPr>
+              <w:t xml:space="preserve">Ya los trae: el pin solo da la orden</w:t>
+            </w:r>
+          </w:p>
+        </w:tc>
+      </w:tr>
+      <w:tr>
+        <w:tc>
+          <w:tcPr>
+            <w:tcW w:w="2480" w:type="dxa"/>
+            <w:shd w:val="clear" w:color="auto" w:fill="EDF1F4"/>
+            <w:tcMar>
+              <w:top w:w="80" w:type="dxa"/>
+              <w:left w:w="110" w:type="dxa"/>
+              <w:bottom w:w="80" w:type="dxa"/>
+              <w:right w:w="110" w:type="dxa"/>
+            </w:tcMar>
+          </w:tcPr>
+          <w:p>
+            <w:pPr>
+              <w:spacing w:after="0"/>
+              <w:rPr>
+                <w:rFonts w:ascii="IBM Plex Sans" w:cs="IBM Plex Sans" w:eastAsia="IBM Plex Sans" w:hAnsi="IBM Plex Sans"/>
+              </w:rPr>
+            </w:pPr>
+            <w:r>
+              <w:rPr>
+                <w:rFonts w:ascii="IBM Plex Sans" w:cs="IBM Plex Sans" w:eastAsia="IBM Plex Sans" w:hAnsi="IBM Plex Sans"/>
+                <w:rtl w:val="0"/>
+              </w:rPr>
+              <w:t xml:space="preserve">Protección contra el pico de la bobina</w:t>
+            </w:r>
+          </w:p>
+        </w:tc>
+        <w:tc>
+          <w:tcPr>
+            <w:tcW w:w="3179" w:type="dxa"/>
+            <w:shd w:val="clear" w:color="auto" w:fill="EDF1F4"/>
+            <w:tcMar>
+              <w:top w:w="80" w:type="dxa"/>
+              <w:left w:w="110" w:type="dxa"/>
+              <w:bottom w:w="80" w:type="dxa"/>
+              <w:right w:w="110" w:type="dxa"/>
+            </w:tcMar>
+          </w:tcPr>
+          <w:p>
+            <w:pPr>
+              <w:spacing w:after="0"/>
+              <w:rPr>
+                <w:rFonts w:ascii="IBM Plex Sans" w:cs="IBM Plex Sans" w:eastAsia="IBM Plex Sans" w:hAnsi="IBM Plex Sans"/>
+              </w:rPr>
+            </w:pPr>
+            <w:r>
+              <w:rPr>
+                <w:rFonts w:ascii="IBM Plex Sans" w:cs="IBM Plex Sans" w:eastAsia="IBM Plex Sans" w:hAnsi="IBM Plex Sans"/>
+                <w:rtl w:val="0"/>
+              </w:rPr>
+              <w:t xml:space="preserve">Hay que agregar el diodo</w:t>
+            </w:r>
+          </w:p>
+        </w:tc>
+        <w:tc>
+          <w:tcPr>
+            <w:tcW w:w="3179" w:type="dxa"/>
+            <w:shd w:val="clear" w:color="auto" w:fill="EDF1F4"/>
+            <w:tcMar>
+              <w:top w:w="80" w:type="dxa"/>
+              <w:left w:w="110" w:type="dxa"/>
+              <w:bottom w:w="80" w:type="dxa"/>
+              <w:right w:w="110" w:type="dxa"/>
+            </w:tcMar>
+          </w:tcPr>
+          <w:p>
+            <w:pPr>
+              <w:spacing w:after="0"/>
+              <w:rPr>
+                <w:rFonts w:ascii="IBM Plex Sans" w:cs="IBM Plex Sans" w:eastAsia="IBM Plex Sans" w:hAnsi="IBM Plex Sans"/>
+              </w:rPr>
+            </w:pPr>
+            <w:r>
+              <w:rPr>
+                <w:rFonts w:ascii="IBM Plex Sans" w:cs="IBM Plex Sans" w:eastAsia="IBM Plex Sans" w:hAnsi="IBM Plex Sans"/>
+                <w:rtl w:val="0"/>
+              </w:rPr>
+              <w:t xml:space="preserve">Incluida</w:t>
+            </w:r>
+          </w:p>
+        </w:tc>
+      </w:tr>
+      <w:tr>
+        <w:tc>
+          <w:tcPr>
+            <w:tcW w:w="2480" w:type="dxa"/>
+            <w:shd w:val="clear" w:color="auto" w:fill="FFFFFF"/>
+            <w:tcMar>
+              <w:top w:w="80" w:type="dxa"/>
+              <w:left w:w="110" w:type="dxa"/>
+              <w:bottom w:w="80" w:type="dxa"/>
+              <w:right w:w="110" w:type="dxa"/>
+            </w:tcMar>
+          </w:tcPr>
+          <w:p>
+            <w:pPr>
+              <w:spacing w:after="0"/>
+              <w:rPr>
+                <w:rFonts w:ascii="IBM Plex Sans" w:cs="IBM Plex Sans" w:eastAsia="IBM Plex Sans" w:hAnsi="IBM Plex Sans"/>
+              </w:rPr>
+            </w:pPr>
+            <w:r>
+              <w:rPr>
+                <w:rFonts w:ascii="IBM Plex Sans" w:cs="IBM Plex Sans" w:eastAsia="IBM Plex Sans" w:hAnsi="IBM Plex Sans"/>
+                <w:rtl w:val="0"/>
+              </w:rPr>
+              <w:t xml:space="preserve">Aislamiento del ESP32</w:t>
+            </w:r>
+          </w:p>
+        </w:tc>
+        <w:tc>
+          <w:tcPr>
+            <w:tcW w:w="3179" w:type="dxa"/>
+            <w:shd w:val="clear" w:color="auto" w:fill="FFFFFF"/>
+            <w:tcMar>
+              <w:top w:w="80" w:type="dxa"/>
+              <w:left w:w="110" w:type="dxa"/>
+              <w:bottom w:w="80" w:type="dxa"/>
+              <w:right w:w="110" w:type="dxa"/>
+            </w:tcMar>
+          </w:tcPr>
+          <w:p>
+            <w:pPr>
+              <w:spacing w:after="0"/>
+              <w:rPr>
+                <w:rFonts w:ascii="IBM Plex Sans" w:cs="IBM Plex Sans" w:eastAsia="IBM Plex Sans" w:hAnsi="IBM Plex Sans"/>
+              </w:rPr>
+            </w:pPr>
+            <w:r>
+              <w:rPr>
+                <w:rFonts w:ascii="IBM Plex Sans" w:cs="IBM Plex Sans" w:eastAsia="IBM Plex Sans" w:hAnsi="IBM Plex Sans"/>
+                <w:rtl w:val="0"/>
+              </w:rPr>
+              <w:t xml:space="preserve">Ninguno, salvo que se agregue un optoacoplador</w:t>
+            </w:r>
+          </w:p>
+        </w:tc>
+        <w:tc>
+          <w:tcPr>
+            <w:tcW w:w="3179" w:type="dxa"/>
+            <w:shd w:val="clear" w:color="auto" w:fill="FFFFFF"/>
+            <w:tcMar>
+              <w:top w:w="80" w:type="dxa"/>
+              <w:left w:w="110" w:type="dxa"/>
+              <w:bottom w:w="80" w:type="dxa"/>
+              <w:right w:w="110" w:type="dxa"/>
+            </w:tcMar>
+          </w:tcPr>
+          <w:p>
+            <w:pPr>
+              <w:spacing w:after="0"/>
+              <w:rPr>
+                <w:rFonts w:ascii="IBM Plex Sans" w:cs="IBM Plex Sans" w:eastAsia="IBM Plex Sans" w:hAnsi="IBM Plex Sans"/>
+              </w:rPr>
+            </w:pPr>
+            <w:r>
+              <w:rPr>
+                <w:rFonts w:ascii="IBM Plex Sans" w:cs="IBM Plex Sans" w:eastAsia="IBM Plex Sans" w:hAnsi="IBM Plex Sans"/>
+                <w:rtl w:val="0"/>
+              </w:rPr>
+              <w:t xml:space="preserve">Un optoacoplador por canal en el módulo de dos canales</w:t>
+            </w:r>
+          </w:p>
+        </w:tc>
+      </w:tr>
+      <w:tr>
+        <w:tc>
+          <w:tcPr>
+            <w:tcW w:w="2480" w:type="dxa"/>
+            <w:shd w:val="clear" w:color="auto" w:fill="EDF1F4"/>
+            <w:tcMar>
+              <w:top w:w="80" w:type="dxa"/>
+              <w:left w:w="110" w:type="dxa"/>
+              <w:bottom w:w="80" w:type="dxa"/>
+              <w:right w:w="110" w:type="dxa"/>
+            </w:tcMar>
+          </w:tcPr>
+          <w:p>
+            <w:pPr>
+              <w:spacing w:after="0"/>
+              <w:rPr>
+                <w:rFonts w:ascii="IBM Plex Sans" w:cs="IBM Plex Sans" w:eastAsia="IBM Plex Sans" w:hAnsi="IBM Plex Sans"/>
+              </w:rPr>
+            </w:pPr>
+            <w:r>
+              <w:rPr>
+                <w:rFonts w:ascii="IBM Plex Sans" w:cs="IBM Plex Sans" w:eastAsia="IBM Plex Sans" w:hAnsi="IBM Plex Sans"/>
+                <w:rtl w:val="0"/>
+              </w:rPr>
+              <w:t xml:space="preserve">Estado al encender el ESP32</w:t>
+            </w:r>
+          </w:p>
+        </w:tc>
+        <w:tc>
+          <w:tcPr>
+            <w:tcW w:w="3179" w:type="dxa"/>
+            <w:shd w:val="clear" w:color="auto" w:fill="EDF1F4"/>
+            <w:tcMar>
+              <w:top w:w="80" w:type="dxa"/>
+              <w:left w:w="110" w:type="dxa"/>
+              <w:bottom w:w="80" w:type="dxa"/>
+              <w:right w:w="110" w:type="dxa"/>
+            </w:tcMar>
+          </w:tcPr>
+          <w:p>
+            <w:pPr>
+              <w:spacing w:after="0"/>
+              <w:rPr>
+                <w:rFonts w:ascii="IBM Plex Sans" w:cs="IBM Plex Sans" w:eastAsia="IBM Plex Sans" w:hAnsi="IBM Plex Sans"/>
+              </w:rPr>
+            </w:pPr>
+            <w:r>
+              <w:rPr>
+                <w:rFonts w:ascii="IBM Plex Sans" w:cs="IBM Plex Sans" w:eastAsia="IBM Plex Sans" w:hAnsi="IBM Plex Sans"/>
+                <w:rtl w:val="0"/>
+              </w:rPr>
+              <w:t xml:space="preserve">Hay que rediseñar las resistencias y el firmware</w:t>
+            </w:r>
+          </w:p>
+        </w:tc>
+        <w:tc>
+          <w:tcPr>
+            <w:tcW w:w="3179" w:type="dxa"/>
+            <w:shd w:val="clear" w:color="auto" w:fill="EDF1F4"/>
+            <w:tcMar>
+              <w:top w:w="80" w:type="dxa"/>
+              <w:left w:w="110" w:type="dxa"/>
+              <w:bottom w:w="80" w:type="dxa"/>
+              <w:right w:w="110" w:type="dxa"/>
+            </w:tcMar>
+          </w:tcPr>
+          <w:p>
+            <w:pPr>
+              <w:spacing w:after="0"/>
+              <w:rPr>
+                <w:rFonts w:ascii="IBM Plex Sans" w:cs="IBM Plex Sans" w:eastAsia="IBM Plex Sans" w:hAnsi="IBM Plex Sans"/>
+              </w:rPr>
+            </w:pPr>
+            <w:r>
+              <w:rPr>
+                <w:rFonts w:ascii="IBM Plex Sans" w:cs="IBM Plex Sans" w:eastAsia="IBM Plex Sans" w:hAnsi="IBM Plex Sans"/>
+                <w:rtl w:val="0"/>
+              </w:rPr>
+              <w:t xml:space="preserve">Resuelto y probado (pull-up y pull-down)</w:t>
+            </w:r>
+          </w:p>
+        </w:tc>
+      </w:tr>
+      <w:tr>
+        <w:tc>
+          <w:tcPr>
+            <w:tcW w:w="2480" w:type="dxa"/>
+            <w:shd w:val="clear" w:color="auto" w:fill="FFFFFF"/>
+            <w:tcMar>
+              <w:top w:w="80" w:type="dxa"/>
+              <w:left w:w="110" w:type="dxa"/>
+              <w:bottom w:w="80" w:type="dxa"/>
+              <w:right w:w="110" w:type="dxa"/>
+            </w:tcMar>
+          </w:tcPr>
+          <w:p>
+            <w:pPr>
+              <w:spacing w:after="0"/>
+              <w:rPr>
+                <w:rFonts w:ascii="IBM Plex Sans" w:cs="IBM Plex Sans" w:eastAsia="IBM Plex Sans" w:hAnsi="IBM Plex Sans"/>
+              </w:rPr>
+            </w:pPr>
+            <w:r>
+              <w:rPr>
+                <w:rFonts w:ascii="IBM Plex Sans" w:cs="IBM Plex Sans" w:eastAsia="IBM Plex Sans" w:hAnsi="IBM Plex Sans"/>
+                <w:rtl w:val="0"/>
+              </w:rPr>
+              <w:t xml:space="preserve">Componentes extra en la plaqueta</w:t>
+            </w:r>
+          </w:p>
+        </w:tc>
+        <w:tc>
+          <w:tcPr>
+            <w:tcW w:w="3179" w:type="dxa"/>
+            <w:shd w:val="clear" w:color="auto" w:fill="FFFFFF"/>
+            <w:tcMar>
+              <w:top w:w="80" w:type="dxa"/>
+              <w:left w:w="110" w:type="dxa"/>
+              <w:bottom w:w="80" w:type="dxa"/>
+              <w:right w:w="110" w:type="dxa"/>
+            </w:tcMar>
+          </w:tcPr>
+          <w:p>
+            <w:pPr>
+              <w:spacing w:after="0"/>
+              <w:rPr>
+                <w:rFonts w:ascii="IBM Plex Sans" w:cs="IBM Plex Sans" w:eastAsia="IBM Plex Sans" w:hAnsi="IBM Plex Sans"/>
+              </w:rPr>
+            </w:pPr>
+            <w:r>
+              <w:rPr>
+                <w:rFonts w:ascii="IBM Plex Sans" w:cs="IBM Plex Sans" w:eastAsia="IBM Plex Sans" w:hAnsi="IBM Plex Sans"/>
+                <w:rtl w:val="0"/>
+              </w:rPr>
+              <w:t xml:space="preserve">Entre 12 y 18, con más de 40 soldaduras</w:t>
+            </w:r>
+          </w:p>
+        </w:tc>
+        <w:tc>
+          <w:tcPr>
+            <w:tcW w:w="3179" w:type="dxa"/>
+            <w:shd w:val="clear" w:color="auto" w:fill="FFFFFF"/>
+            <w:tcMar>
+              <w:top w:w="80" w:type="dxa"/>
+              <w:left w:w="110" w:type="dxa"/>
+              <w:bottom w:w="80" w:type="dxa"/>
+              <w:right w:w="110" w:type="dxa"/>
+            </w:tcMar>
+          </w:tcPr>
+          <w:p>
+            <w:pPr>
+              <w:spacing w:after="0"/>
+              <w:rPr>
+                <w:rFonts w:ascii="IBM Plex Sans" w:cs="IBM Plex Sans" w:eastAsia="IBM Plex Sans" w:hAnsi="IBM Plex Sans"/>
+              </w:rPr>
+            </w:pPr>
+            <w:r>
+              <w:rPr>
+                <w:rFonts w:ascii="IBM Plex Sans" w:cs="IBM Plex Sans" w:eastAsia="IBM Plex Sans" w:hAnsi="IBM Plex Sans"/>
+                <w:rtl w:val="0"/>
+              </w:rPr>
+              <w:t xml:space="preserve">Ninguno</w:t>
+            </w:r>
+          </w:p>
+        </w:tc>
+      </w:tr>
+      <w:tr>
+        <w:tc>
+          <w:tcPr>
+            <w:tcW w:w="2480" w:type="dxa"/>
+            <w:shd w:val="clear" w:color="auto" w:fill="EDF1F4"/>
+            <w:tcMar>
+              <w:top w:w="80" w:type="dxa"/>
+              <w:left w:w="110" w:type="dxa"/>
+              <w:bottom w:w="80" w:type="dxa"/>
+              <w:right w:w="110" w:type="dxa"/>
+            </w:tcMar>
+          </w:tcPr>
+          <w:p>
+            <w:pPr>
+              <w:spacing w:after="0"/>
+              <w:rPr>
+                <w:rFonts w:ascii="IBM Plex Sans" w:cs="IBM Plex Sans" w:eastAsia="IBM Plex Sans" w:hAnsi="IBM Plex Sans"/>
+              </w:rPr>
+            </w:pPr>
+            <w:r>
+              <w:rPr>
+                <w:rFonts w:ascii="IBM Plex Sans" w:cs="IBM Plex Sans" w:eastAsia="IBM Plex Sans" w:hAnsi="IBM Plex Sans"/>
+                <w:rtl w:val="0"/>
+              </w:rPr>
+              <w:t xml:space="preserve">Conexión de los contactos</w:t>
+            </w:r>
+          </w:p>
+        </w:tc>
+        <w:tc>
+          <w:tcPr>
+            <w:tcW w:w="3179" w:type="dxa"/>
+            <w:shd w:val="clear" w:color="auto" w:fill="EDF1F4"/>
+            <w:tcMar>
+              <w:top w:w="80" w:type="dxa"/>
+              <w:left w:w="110" w:type="dxa"/>
+              <w:bottom w:w="80" w:type="dxa"/>
+              <w:right w:w="110" w:type="dxa"/>
+            </w:tcMar>
+          </w:tcPr>
+          <w:p>
+            <w:pPr>
+              <w:spacing w:after="0"/>
+              <w:rPr>
+                <w:rFonts w:ascii="IBM Plex Sans" w:cs="IBM Plex Sans" w:eastAsia="IBM Plex Sans" w:hAnsi="IBM Plex Sans"/>
+              </w:rPr>
+            </w:pPr>
+            <w:r>
+              <w:rPr>
+                <w:rFonts w:ascii="IBM Plex Sans" w:cs="IBM Plex Sans" w:eastAsia="IBM Plex Sans" w:hAnsi="IBM Plex Sans"/>
+                <w:rtl w:val="0"/>
+              </w:rPr>
+              <w:t xml:space="preserve">Soldar cables a las patas o agregar borneras</w:t>
+            </w:r>
+          </w:p>
+        </w:tc>
+        <w:tc>
+          <w:tcPr>
+            <w:tcW w:w="3179" w:type="dxa"/>
+            <w:shd w:val="clear" w:color="auto" w:fill="EDF1F4"/>
+            <w:tcMar>
+              <w:top w:w="80" w:type="dxa"/>
+              <w:left w:w="110" w:type="dxa"/>
+              <w:bottom w:w="80" w:type="dxa"/>
+              <w:right w:w="110" w:type="dxa"/>
+            </w:tcMar>
+          </w:tcPr>
+          <w:p>
+            <w:pPr>
+              <w:spacing w:after="0"/>
+              <w:rPr>
+                <w:rFonts w:ascii="IBM Plex Sans" w:cs="IBM Plex Sans" w:eastAsia="IBM Plex Sans" w:hAnsi="IBM Plex Sans"/>
+              </w:rPr>
+            </w:pPr>
+            <w:r>
+              <w:rPr>
+                <w:rFonts w:ascii="IBM Plex Sans" w:cs="IBM Plex Sans" w:eastAsia="IBM Plex Sans" w:hAnsi="IBM Plex Sans"/>
+                <w:rtl w:val="0"/>
+              </w:rPr>
+              <w:t xml:space="preserve">Borneras de tornillo incluidas</w:t>
+            </w:r>
+          </w:p>
+        </w:tc>
+      </w:tr>
+      <w:tr>
+        <w:tc>
+          <w:tcPr>
+            <w:tcW w:w="2480" w:type="dxa"/>
+            <w:shd w:val="clear" w:color="auto" w:fill="FFFFFF"/>
+            <w:tcMar>
+              <w:top w:w="80" w:type="dxa"/>
+              <w:left w:w="110" w:type="dxa"/>
+              <w:bottom w:w="80" w:type="dxa"/>
+              <w:right w:w="110" w:type="dxa"/>
+            </w:tcMar>
+          </w:tcPr>
+          <w:p>
+            <w:pPr>
+              <w:spacing w:after="0"/>
+              <w:rPr>
+                <w:rFonts w:ascii="IBM Plex Sans" w:cs="IBM Plex Sans" w:eastAsia="IBM Plex Sans" w:hAnsi="IBM Plex Sans"/>
+              </w:rPr>
+            </w:pPr>
+            <w:r>
+              <w:rPr>
+                <w:rFonts w:ascii="IBM Plex Sans" w:cs="IBM Plex Sans" w:eastAsia="IBM Plex Sans" w:hAnsi="IBM Plex Sans"/>
+                <w:rtl w:val="0"/>
+              </w:rPr>
+              <w:t xml:space="preserve">Reemplazo en la fábrica</w:t>
+            </w:r>
+          </w:p>
+        </w:tc>
+        <w:tc>
+          <w:tcPr>
+            <w:tcW w:w="3179" w:type="dxa"/>
+            <w:shd w:val="clear" w:color="auto" w:fill="FFFFFF"/>
+            <w:tcMar>
+              <w:top w:w="80" w:type="dxa"/>
+              <w:left w:w="110" w:type="dxa"/>
+              <w:bottom w:w="80" w:type="dxa"/>
+              <w:right w:w="110" w:type="dxa"/>
+            </w:tcMar>
+          </w:tcPr>
+          <w:p>
+            <w:pPr>
+              <w:spacing w:after="0"/>
+              <w:rPr>
+                <w:rFonts w:ascii="IBM Plex Sans" w:cs="IBM Plex Sans" w:eastAsia="IBM Plex Sans" w:hAnsi="IBM Plex Sans"/>
+              </w:rPr>
+            </w:pPr>
+            <w:r>
+              <w:rPr>
+                <w:rFonts w:ascii="IBM Plex Sans" w:cs="IBM Plex Sans" w:eastAsia="IBM Plex Sans" w:hAnsi="IBM Plex Sans"/>
+                <w:rtl w:val="0"/>
+              </w:rPr>
+              <w:t xml:space="preserve">Desoldar y volver a soldar</w:t>
+            </w:r>
+          </w:p>
+        </w:tc>
+        <w:tc>
+          <w:tcPr>
+            <w:tcW w:w="3179" w:type="dxa"/>
+            <w:shd w:val="clear" w:color="auto" w:fill="FFFFFF"/>
+            <w:tcMar>
+              <w:top w:w="80" w:type="dxa"/>
+              <w:left w:w="110" w:type="dxa"/>
+              <w:bottom w:w="80" w:type="dxa"/>
+              <w:right w:w="110" w:type="dxa"/>
+            </w:tcMar>
+          </w:tcPr>
+          <w:p>
+            <w:pPr>
+              <w:spacing w:after="0"/>
+              <w:rPr>
+                <w:rFonts w:ascii="IBM Plex Sans" w:cs="IBM Plex Sans" w:eastAsia="IBM Plex Sans" w:hAnsi="IBM Plex Sans"/>
+              </w:rPr>
+            </w:pPr>
+            <w:r>
+              <w:rPr>
+                <w:rFonts w:ascii="IBM Plex Sans" w:cs="IBM Plex Sans" w:eastAsia="IBM Plex Sans" w:hAnsi="IBM Plex Sans"/>
+                <w:rtl w:val="0"/>
+              </w:rPr>
+              <w:t xml:space="preserve">Desatornillar y cambiar el módulo</w:t>
+            </w:r>
+          </w:p>
+        </w:tc>
+      </w:tr>
+    </w:tbl>
+    <w:p>
+      <w:pPr>
+        <w:rPr>
+          <w:rFonts w:ascii="IBM Plex Sans" w:cs="IBM Plex Sans" w:eastAsia="IBM Plex Sans" w:hAnsi="IBM Plex Sans"/>
+        </w:rPr>
+      </w:pPr>
+    </w:p>
+    <w:p>
+      <w:pPr>
+        <w:rPr>
+          <w:rFonts w:ascii="IBM Plex Sans" w:cs="IBM Plex Sans" w:eastAsia="IBM Plex Sans" w:hAnsi="IBM Plex Sans"/>
+        </w:rPr>
+      </w:pPr>
+      <w:r>
+        <w:rPr>
+          <w:rFonts w:ascii="Questrial" w:cs="Questrial" w:eastAsia="Questrial" w:hAnsi="Questrial"/>
+          <w:b w:val="1"/>
+          <w:bCs w:val="1"/>
+          <w:color w:val="3D6B96"/>
+          <w:sz w:val="26"/>
+          <w:szCs w:val="26"/>
+          <w:rtl w:val="0"/>
+        </w:rPr>
+        <w:t xml:space="preserve">Conclusión</w:t>
+      </w:r>
+    </w:p>
+    <w:p>
+      <w:pPr>
+        <w:jc w:val="both"/>
+        <w:rPr>
+          <w:rFonts w:ascii="IBM Plex Sans" w:cs="IBM Plex Sans" w:eastAsia="IBM Plex Sans" w:hAnsi="IBM Plex Sans"/>
+        </w:rPr>
+      </w:pPr>
+      <w:r>
+        <w:rPr>
+          <w:rFonts w:ascii="IBM Plex Sans" w:cs="IBM Plex Sans" w:eastAsia="IBM Plex Sans" w:hAnsi="IBM Plex Sans"/>
+          <w:rtl w:val="0"/>
+        </w:rPr>
+        <w:t xml:space="preserve">El relé es el mismo en los dos casos: un Songle de 5 V y 10 A. Lo que cambia es todo lo que lo rodea. El módulo resuelve de fábrica la etapa que maneja la bobina, la protección contra su pico de tensión, el aislamiento y las borneras, y es lo que el firmware y el conexionado del proyecto ya tienen en cuenta. Por eso usamos módulos de relé, montados sobre la plaqueta, y no relés sueltos.</w:t>
+      </w:r>
+    </w:p>
+    <w:p>
+      <w:pPr>
+        <w:pBdr>
+          <w:bottom w:color="000000" w:space="1" w:sz="6" w:val="single"/>
+        </w:pBdr>
+        <w:rPr>
+          <w:rFonts w:ascii="IBM Plex Sans" w:cs="IBM Plex Sans" w:eastAsia="IBM Plex Sans" w:hAnsi="IBM Plex Sans"/>
+        </w:rPr>
+      </w:pPr>
+    </w:p>
+    <w:p>
+      <w:pPr>
+        <w:rPr>
+          <w:rFonts w:ascii="IBM Plex Sans" w:cs="IBM Plex Sans" w:eastAsia="IBM Plex Sans" w:hAnsi="IBM Plex Sans"/>
+        </w:rPr>
+      </w:pPr>
     </w:p>
     <w:p>
       <w:pPr>

</xml_diff>

<commit_message>
Word sin avisos del esquema estricto
Once Word traían avisos heredados del esquema (orden de elementos en las
propiedades de párrafos, celdas, bordes y controles; colores de tema con
ceros de más; espaciados con decimales; márgenes sin gutter; sombreados
sin tipo). Se ordenaron y completaron: los 20 Word pasan el esquema, el
texto es el mismo y los PDF exportados de nuevo son iguales píxel por
píxel a los que ya estaban, así que los PDF no cambian.

Co-Authored-By: Claude Opus 5.5 <noreply@anthropic.com>
Claude-Session: https://claude.ai/code/session_01QiY8ZZNAM9gwPKiqSkCaaj
</commit_message>
<xml_diff>
--- a/documentacion_proyecto/Arbol de problemas y soluciones.docx
+++ b/documentacion_proyecto/Arbol de problemas y soluciones.docx
@@ -88,7 +88,7 @@
           <w:between w:space="0" w:sz="0" w:val="nil"/>
         </w:pBdr>
         <w:shd w:fill="auto" w:val="clear"/>
-        <w:spacing w:after="160" w:before="0" w:line="278.00000000000006" w:lineRule="auto"/>
+        <w:spacing w:after="160" w:before="0" w:line="278" w:lineRule="auto"/>
         <w:ind w:left="720" w:right="0" w:hanging="360"/>
         <w:jc w:val="left"/>
         <w:rPr>
@@ -175,7 +175,7 @@
           <w:between w:space="0" w:sz="0" w:val="nil"/>
         </w:pBdr>
         <w:shd w:fill="auto" w:val="clear"/>
-        <w:spacing w:after="0" w:before="0" w:line="278.00000000000006" w:lineRule="auto"/>
+        <w:spacing w:after="0" w:before="0" w:line="278" w:lineRule="auto"/>
         <w:ind w:left="720" w:right="0" w:hanging="360"/>
         <w:jc w:val="left"/>
         <w:rPr>
@@ -243,7 +243,7 @@
           <w:between w:space="0" w:sz="0" w:val="nil"/>
         </w:pBdr>
         <w:shd w:fill="auto" w:val="clear"/>
-        <w:spacing w:after="0" w:before="0" w:line="278.00000000000006" w:lineRule="auto"/>
+        <w:spacing w:after="0" w:before="0" w:line="278" w:lineRule="auto"/>
         <w:ind w:left="720" w:right="0" w:firstLine="0"/>
         <w:jc w:val="left"/>
         <w:rPr>
@@ -274,7 +274,7 @@
           <w:between w:space="0" w:sz="0" w:val="nil"/>
         </w:pBdr>
         <w:shd w:fill="auto" w:val="clear"/>
-        <w:spacing w:after="0" w:before="0" w:line="278.00000000000006" w:lineRule="auto"/>
+        <w:spacing w:after="0" w:before="0" w:line="278" w:lineRule="auto"/>
         <w:ind w:left="720" w:right="0" w:hanging="360"/>
         <w:jc w:val="left"/>
         <w:rPr>
@@ -342,7 +342,7 @@
           <w:between w:space="0" w:sz="0" w:val="nil"/>
         </w:pBdr>
         <w:shd w:fill="auto" w:val="clear"/>
-        <w:spacing w:after="0" w:before="0" w:line="278.00000000000006" w:lineRule="auto"/>
+        <w:spacing w:after="0" w:before="0" w:line="278" w:lineRule="auto"/>
         <w:ind w:left="720" w:right="0" w:firstLine="0"/>
         <w:jc w:val="left"/>
         <w:rPr>
@@ -373,7 +373,7 @@
           <w:between w:space="0" w:sz="0" w:val="nil"/>
         </w:pBdr>
         <w:shd w:fill="auto" w:val="clear"/>
-        <w:spacing w:after="0" w:before="0" w:line="278.00000000000006" w:lineRule="auto"/>
+        <w:spacing w:after="0" w:before="0" w:line="278" w:lineRule="auto"/>
         <w:ind w:left="720" w:right="0" w:hanging="360"/>
         <w:jc w:val="left"/>
         <w:rPr>
@@ -441,7 +441,7 @@
           <w:between w:space="0" w:sz="0" w:val="nil"/>
         </w:pBdr>
         <w:shd w:fill="auto" w:val="clear"/>
-        <w:spacing w:after="0" w:before="0" w:line="278.00000000000006" w:lineRule="auto"/>
+        <w:spacing w:after="0" w:before="0" w:line="278" w:lineRule="auto"/>
         <w:ind w:left="720" w:right="0" w:firstLine="0"/>
         <w:jc w:val="left"/>
         <w:rPr>
@@ -472,7 +472,7 @@
           <w:between w:space="0" w:sz="0" w:val="nil"/>
         </w:pBdr>
         <w:shd w:fill="auto" w:val="clear"/>
-        <w:spacing w:after="0" w:before="0" w:line="278.00000000000006" w:lineRule="auto"/>
+        <w:spacing w:after="0" w:before="0" w:line="278" w:lineRule="auto"/>
         <w:ind w:left="720" w:right="0" w:hanging="360"/>
         <w:jc w:val="left"/>
         <w:rPr>
@@ -564,7 +564,7 @@
           <w:between w:space="0" w:sz="0" w:val="nil"/>
         </w:pBdr>
         <w:shd w:fill="auto" w:val="clear"/>
-        <w:spacing w:after="0" w:before="0" w:line="278.00000000000006" w:lineRule="auto"/>
+        <w:spacing w:after="0" w:before="0" w:line="278" w:lineRule="auto"/>
         <w:ind w:left="720" w:right="0" w:firstLine="0"/>
         <w:jc w:val="left"/>
         <w:rPr>
@@ -595,7 +595,7 @@
           <w:between w:space="0" w:sz="0" w:val="nil"/>
         </w:pBdr>
         <w:shd w:fill="auto" w:val="clear"/>
-        <w:spacing w:after="0" w:before="0" w:line="278.00000000000006" w:lineRule="auto"/>
+        <w:spacing w:after="0" w:before="0" w:line="278" w:lineRule="auto"/>
         <w:ind w:left="720" w:right="0" w:hanging="360"/>
         <w:jc w:val="left"/>
         <w:rPr>
@@ -639,7 +639,7 @@
           <w:between w:space="0" w:sz="0" w:val="nil"/>
         </w:pBdr>
         <w:shd w:fill="auto" w:val="clear"/>
-        <w:spacing w:after="0" w:before="0" w:line="278.00000000000006" w:lineRule="auto"/>
+        <w:spacing w:after="0" w:before="0" w:line="278" w:lineRule="auto"/>
         <w:ind w:left="720" w:right="0" w:firstLine="0"/>
         <w:jc w:val="left"/>
         <w:rPr>
@@ -670,7 +670,7 @@
           <w:between w:space="0" w:sz="0" w:val="nil"/>
         </w:pBdr>
         <w:shd w:fill="auto" w:val="clear"/>
-        <w:spacing w:after="160" w:before="0" w:line="278.00000000000006" w:lineRule="auto"/>
+        <w:spacing w:after="160" w:before="0" w:line="278" w:lineRule="auto"/>
         <w:ind w:left="720" w:right="0" w:hanging="360"/>
         <w:jc w:val="left"/>
         <w:rPr>
@@ -714,7 +714,7 @@
           <w:between w:space="0" w:sz="0" w:val="nil"/>
         </w:pBdr>
         <w:shd w:fill="auto" w:val="clear"/>
-        <w:spacing w:after="160" w:before="0" w:line="278.00000000000006" w:lineRule="auto"/>
+        <w:spacing w:after="160" w:before="0" w:line="278" w:lineRule="auto"/>
         <w:ind w:left="720" w:right="0" w:firstLine="0"/>
         <w:jc w:val="left"/>
         <w:rPr>
@@ -745,7 +745,7 @@
           <w:between w:space="0" w:sz="0" w:val="nil"/>
         </w:pBdr>
         <w:shd w:fill="auto" w:val="clear"/>
-        <w:spacing w:after="160" w:before="0" w:line="278.00000000000006" w:lineRule="auto"/>
+        <w:spacing w:after="160" w:before="0" w:line="278" w:lineRule="auto"/>
         <w:ind w:left="720" w:right="0" w:hanging="360"/>
         <w:jc w:val="left"/>
         <w:rPr>
@@ -779,7 +779,7 @@
           <w:between w:space="0" w:sz="0" w:val="nil"/>
         </w:pBdr>
         <w:shd w:fill="auto" w:val="clear"/>
-        <w:spacing w:after="160" w:before="0" w:line="278.00000000000006" w:lineRule="auto"/>
+        <w:spacing w:after="160" w:before="0" w:line="278" w:lineRule="auto"/>
         <w:ind w:right="0"/>
         <w:jc w:val="left"/>
         <w:rPr>
@@ -806,7 +806,7 @@
           <w:between w:space="0" w:sz="0" w:val="nil"/>
         </w:pBdr>
         <w:shd w:fill="auto" w:val="clear"/>
-        <w:spacing w:after="160" w:before="0" w:line="278.00000000000006" w:lineRule="auto"/>
+        <w:spacing w:after="160" w:before="0" w:line="278" w:lineRule="auto"/>
         <w:ind w:right="0"/>
         <w:jc w:val="left"/>
         <w:rPr>
@@ -1149,7 +1149,7 @@
           <w:between w:space="0" w:sz="0" w:val="nil"/>
         </w:pBdr>
         <w:shd w:fill="auto" w:val="clear"/>
-        <w:spacing w:after="160" w:before="0" w:line="278.00000000000006" w:lineRule="auto"/>
+        <w:spacing w:after="160" w:before="0" w:line="278" w:lineRule="auto"/>
         <w:ind w:left="720" w:right="0" w:hanging="360"/>
         <w:jc w:val="left"/>
         <w:rPr>
@@ -1236,7 +1236,7 @@
           <w:between w:space="0" w:sz="0" w:val="nil"/>
         </w:pBdr>
         <w:shd w:fill="auto" w:val="clear"/>
-        <w:spacing w:after="0" w:before="0" w:line="278.00000000000006" w:lineRule="auto"/>
+        <w:spacing w:after="0" w:before="0" w:line="278" w:lineRule="auto"/>
         <w:ind w:left="720" w:right="0" w:hanging="360"/>
         <w:jc w:val="both"/>
         <w:rPr>
@@ -1280,7 +1280,7 @@
           <w:between w:space="0" w:sz="0" w:val="nil"/>
         </w:pBdr>
         <w:shd w:fill="auto" w:val="clear"/>
-        <w:spacing w:after="0" w:before="0" w:line="278.00000000000006" w:lineRule="auto"/>
+        <w:spacing w:after="0" w:before="0" w:line="278" w:lineRule="auto"/>
         <w:ind w:left="720" w:right="0" w:firstLine="0"/>
         <w:jc w:val="left"/>
         <w:rPr>
@@ -1311,7 +1311,7 @@
           <w:between w:space="0" w:sz="0" w:val="nil"/>
         </w:pBdr>
         <w:shd w:fill="auto" w:val="clear"/>
-        <w:spacing w:after="0" w:before="0" w:line="278.00000000000006" w:lineRule="auto"/>
+        <w:spacing w:after="0" w:before="0" w:line="278" w:lineRule="auto"/>
         <w:ind w:left="720" w:right="0" w:hanging="360"/>
         <w:jc w:val="left"/>
         <w:rPr>
@@ -1355,7 +1355,7 @@
           <w:between w:space="0" w:sz="0" w:val="nil"/>
         </w:pBdr>
         <w:shd w:fill="auto" w:val="clear"/>
-        <w:spacing w:after="0" w:before="0" w:line="278.00000000000006" w:lineRule="auto"/>
+        <w:spacing w:after="0" w:before="0" w:line="278" w:lineRule="auto"/>
         <w:ind w:left="720" w:right="0" w:firstLine="0"/>
         <w:jc w:val="left"/>
         <w:rPr>
@@ -1388,7 +1388,7 @@
           <w:between w:space="0" w:sz="0" w:val="nil"/>
         </w:pBdr>
         <w:shd w:fill="auto" w:val="clear"/>
-        <w:spacing w:after="0" w:before="0" w:line="278.00000000000006" w:lineRule="auto"/>
+        <w:spacing w:after="0" w:before="0" w:line="278" w:lineRule="auto"/>
         <w:ind w:left="720" w:right="0" w:hanging="360"/>
         <w:jc w:val="left"/>
         <w:rPr>
@@ -1458,7 +1458,7 @@
           <w:between w:space="0" w:sz="0" w:val="nil"/>
         </w:pBdr>
         <w:shd w:fill="auto" w:val="clear"/>
-        <w:spacing w:after="0" w:before="0" w:line="278.00000000000006" w:lineRule="auto"/>
+        <w:spacing w:after="0" w:before="0" w:line="278" w:lineRule="auto"/>
         <w:ind w:left="720" w:right="0" w:firstLine="0"/>
         <w:jc w:val="left"/>
         <w:rPr>
@@ -1489,7 +1489,7 @@
           <w:between w:space="0" w:sz="0" w:val="nil"/>
         </w:pBdr>
         <w:shd w:fill="auto" w:val="clear"/>
-        <w:spacing w:after="0" w:before="0" w:line="278.00000000000006" w:lineRule="auto"/>
+        <w:spacing w:after="0" w:before="0" w:line="278" w:lineRule="auto"/>
         <w:ind w:left="720" w:right="0" w:hanging="360"/>
         <w:jc w:val="left"/>
         <w:rPr>
@@ -1583,7 +1583,7 @@
           <w:between w:space="0" w:sz="0" w:val="nil"/>
         </w:pBdr>
         <w:shd w:fill="auto" w:val="clear"/>
-        <w:spacing w:after="0" w:before="0" w:line="278.00000000000006" w:lineRule="auto"/>
+        <w:spacing w:after="0" w:before="0" w:line="278" w:lineRule="auto"/>
         <w:ind w:left="720" w:right="0" w:firstLine="0"/>
         <w:jc w:val="left"/>
         <w:rPr>
@@ -1614,7 +1614,7 @@
           <w:between w:space="0" w:sz="0" w:val="nil"/>
         </w:pBdr>
         <w:shd w:fill="auto" w:val="clear"/>
-        <w:spacing w:after="0" w:before="0" w:line="278.00000000000006" w:lineRule="auto"/>
+        <w:spacing w:after="0" w:before="0" w:line="278" w:lineRule="auto"/>
         <w:ind w:left="720" w:right="0" w:hanging="360"/>
         <w:jc w:val="left"/>
         <w:rPr>
@@ -1708,7 +1708,7 @@
           <w:between w:space="0" w:sz="0" w:val="nil"/>
         </w:pBdr>
         <w:shd w:fill="auto" w:val="clear"/>
-        <w:spacing w:after="0" w:before="0" w:line="278.00000000000006" w:lineRule="auto"/>
+        <w:spacing w:after="0" w:before="0" w:line="278" w:lineRule="auto"/>
         <w:ind w:left="720" w:right="0" w:firstLine="0"/>
         <w:jc w:val="left"/>
         <w:rPr>
@@ -1739,7 +1739,7 @@
           <w:between w:space="0" w:sz="0" w:val="nil"/>
         </w:pBdr>
         <w:shd w:fill="auto" w:val="clear"/>
-        <w:spacing w:after="0" w:before="0" w:line="278.00000000000006" w:lineRule="auto"/>
+        <w:spacing w:after="0" w:before="0" w:line="278" w:lineRule="auto"/>
         <w:ind w:left="720" w:right="0" w:hanging="360"/>
         <w:jc w:val="left"/>
         <w:rPr>
@@ -1833,7 +1833,7 @@
           <w:between w:space="0" w:sz="0" w:val="nil"/>
         </w:pBdr>
         <w:shd w:fill="auto" w:val="clear"/>
-        <w:spacing w:after="160" w:before="0" w:line="278.00000000000006" w:lineRule="auto"/>
+        <w:spacing w:after="160" w:before="0" w:line="278" w:lineRule="auto"/>
         <w:ind w:left="720" w:right="0" w:firstLine="0"/>
         <w:jc w:val="left"/>
         <w:rPr>
@@ -1864,7 +1864,7 @@
           <w:between w:space="0" w:sz="0" w:val="nil"/>
         </w:pBdr>
         <w:shd w:fill="auto" w:val="clear"/>
-        <w:spacing w:after="160" w:before="0" w:line="278.00000000000006" w:lineRule="auto"/>
+        <w:spacing w:after="160" w:before="0" w:line="278" w:lineRule="auto"/>
         <w:ind w:left="720" w:right="0" w:hanging="360"/>
         <w:jc w:val="left"/>
         <w:rPr>
@@ -2251,7 +2251,7 @@
           <w:between w:space="0" w:sz="0" w:val="nil"/>
         </w:pBdr>
         <w:shd w:fill="auto" w:val="clear"/>
-        <w:spacing w:after="160" w:before="0" w:line="278.00000000000006" w:lineRule="auto"/>
+        <w:spacing w:after="160" w:before="0" w:line="278" w:lineRule="auto"/>
         <w:ind w:left="720" w:right="0" w:hanging="360"/>
         <w:jc w:val="left"/>
         <w:rPr>
@@ -2335,7 +2335,7 @@
           <w:between w:space="0" w:sz="0" w:val="nil"/>
         </w:pBdr>
         <w:shd w:fill="auto" w:val="clear"/>
-        <w:spacing w:after="160" w:before="0" w:line="278.00000000000006" w:lineRule="auto"/>
+        <w:spacing w:after="160" w:before="0" w:line="278" w:lineRule="auto"/>
         <w:ind w:left="720" w:right="0" w:hanging="360"/>
         <w:jc w:val="left"/>
         <w:rPr>
@@ -2402,7 +2402,7 @@
           <w:between w:space="0" w:sz="0" w:val="nil"/>
         </w:pBdr>
         <w:shd w:fill="auto" w:val="clear"/>
-        <w:spacing w:after="160" w:before="0" w:line="278.00000000000006" w:lineRule="auto"/>
+        <w:spacing w:after="160" w:before="0" w:line="278" w:lineRule="auto"/>
         <w:ind w:left="720" w:right="0" w:hanging="360"/>
         <w:jc w:val="left"/>
         <w:rPr>
@@ -2462,7 +2462,7 @@
           <w:between w:space="0" w:sz="0" w:val="nil"/>
         </w:pBdr>
         <w:shd w:fill="auto" w:val="clear"/>
-        <w:spacing w:after="160" w:before="0" w:line="278.00000000000006" w:lineRule="auto"/>
+        <w:spacing w:after="160" w:before="0" w:line="278" w:lineRule="auto"/>
         <w:ind w:left="720" w:right="0" w:hanging="360"/>
         <w:jc w:val="left"/>
         <w:rPr>
@@ -2524,7 +2524,7 @@
           <w:between w:space="0" w:sz="0" w:val="nil"/>
         </w:pBdr>
         <w:shd w:fill="auto" w:val="clear"/>
-        <w:spacing w:after="160" w:before="0" w:line="278.00000000000006" w:lineRule="auto"/>
+        <w:spacing w:after="160" w:before="0" w:line="278" w:lineRule="auto"/>
         <w:ind w:left="720" w:right="0" w:hanging="360"/>
         <w:jc w:val="left"/>
         <w:rPr>
@@ -2591,7 +2591,7 @@
           <w:between w:space="0" w:sz="0" w:val="nil"/>
         </w:pBdr>
         <w:shd w:fill="auto" w:val="clear"/>
-        <w:spacing w:after="160" w:before="0" w:line="278.00000000000006" w:lineRule="auto"/>
+        <w:spacing w:after="160" w:before="0" w:line="278" w:lineRule="auto"/>
         <w:ind w:left="720" w:right="0" w:hanging="360"/>
         <w:jc w:val="left"/>
         <w:rPr>
@@ -2642,7 +2642,7 @@
           <w:between w:space="0" w:sz="0" w:val="nil"/>
         </w:pBdr>
         <w:shd w:fill="auto" w:val="clear"/>
-        <w:spacing w:after="160" w:before="0" w:line="278.00000000000006" w:lineRule="auto"/>
+        <w:spacing w:after="160" w:before="0" w:line="278" w:lineRule="auto"/>
         <w:ind w:left="720" w:right="0" w:firstLine="0"/>
         <w:jc w:val="left"/>
         <w:rPr>
@@ -2669,7 +2669,7 @@
           <w:between w:space="0" w:sz="0" w:val="nil"/>
         </w:pBdr>
         <w:shd w:fill="auto" w:val="clear"/>
-        <w:spacing w:after="160" w:before="0" w:line="278.00000000000006" w:lineRule="auto"/>
+        <w:spacing w:after="160" w:before="0" w:line="278" w:lineRule="auto"/>
         <w:ind w:left="0" w:right="0" w:firstLine="0"/>
         <w:jc w:val="left"/>
         <w:rPr>
@@ -6067,7 +6067,7 @@
     </w:p>
     <w:sectPr>
       <w:pgSz w:h="15840" w:w="12240" w:orient="portrait"/>
-      <w:pgMar w:bottom="1417" w:top="1417" w:left="1701" w:right="1701" w:header="720" w:footer="720"/>
+      <w:pgMar w:bottom="1417" w:top="1417" w:left="1701" w:right="1701" w:header="720" w:footer="720" w:gutter="0"/>
       <w:pgNumType w:start="1"/>
     </w:sectPr>
   </w:body>
@@ -7507,7 +7507,7 @@
     </w:rPrDefault>
     <w:pPrDefault>
       <w:pPr>
-        <w:spacing w:after="160" w:line="278.00000000000006" w:lineRule="auto"/>
+        <w:spacing w:after="160" w:line="278" w:lineRule="auto"/>
       </w:pPr>
     </w:pPrDefault>
   </w:docDefaults>

</xml_diff>